<commit_message>
Tambah grafik Kurva-S grayscale ke PDF korporat persiapan instalasi
Chart matplotlib hitam-putih (garis aktual solid, proyeksi putus-putus,
ambang 95% Pertamina) disisipkan di Bagian 2 sebelum tabel tren.
</commit_message>
<xml_diff>
--- a/Deliverables/Kurva_S_Persiapan_Instalasi_RU-IV_Cilacap.docx
+++ b/Deliverables/Kurva_S_Persiapan_Instalasi_RU-IV_Cilacap.docx
@@ -793,6 +793,60 @@
           <w:sz w:val="19"/>
         </w:rPr>
         <w:t>Baru ada dua titik data yang bisa dipertanggungjawabkan secara tertulis: saat checklist kerja bersama pertama kali disusun (10 September 2026) dan hari ini (18 September 2026). Belum ada pengukuran harian di antara keduanya, sehingga tren di bawah ini menghubungkan dua titik nyata, bukan proyeksi presisi harian.</w:t>
+      </w:r>
+    </w:p>
+    <w:p>
+      <w:pPr>
+        <w:jc w:val="center"/>
+      </w:pPr>
+      <w:r>
+        <w:drawing>
+          <wp:inline xmlns:a="http://schemas.openxmlformats.org/drawingml/2006/main" xmlns:pic="http://schemas.openxmlformats.org/drawingml/2006/picture">
+            <wp:extent cx="6126480" cy="2932889"/>
+            <wp:docPr id="1" name="Picture 1"/>
+            <wp:cNvGraphicFramePr>
+              <a:graphicFrameLocks noChangeAspect="1"/>
+            </wp:cNvGraphicFramePr>
+            <a:graphic>
+              <a:graphicData uri="http://schemas.openxmlformats.org/drawingml/2006/picture">
+                <pic:pic>
+                  <pic:nvPicPr>
+                    <pic:cNvPr id="0" name="kurva_s_instalasi_chart.png"/>
+                    <pic:cNvPicPr/>
+                  </pic:nvPicPr>
+                  <pic:blipFill>
+                    <a:blip r:embed="rId11"/>
+                    <a:stretch>
+                      <a:fillRect/>
+                    </a:stretch>
+                  </pic:blipFill>
+                  <pic:spPr>
+                    <a:xfrm>
+                      <a:off x="0" y="0"/>
+                      <a:ext cx="6126480" cy="2932889"/>
+                    </a:xfrm>
+                    <a:prstGeom prst="rect"/>
+                  </pic:spPr>
+                </pic:pic>
+              </a:graphicData>
+            </a:graphic>
+          </wp:inline>
+        </w:drawing>
+      </w:r>
+    </w:p>
+    <w:p>
+      <w:pPr>
+        <w:spacing w:after="240"/>
+        <w:jc w:val="center"/>
+      </w:pPr>
+      <w:r>
+        <w:rPr>
+          <w:rFonts w:ascii="Arial" w:hAnsi="Arial"/>
+          <w:i/>
+          <w:color w:val="808080"/>
+          <w:sz w:val="16"/>
+        </w:rPr>
+        <w:t>Grafik 1. Kurva-S persiapan instalasi RU IV Cilacap — garis solid: aktual, garis putus-putus: proyeksi arah (belum bertanggal pasti)</w:t>
       </w:r>
     </w:p>
     <w:tbl>

</xml_diff>

<commit_message>
Reframe grafik Kurva-S ke kesiapan LGU (100%), bukan gabungan 3 pihak
Pertanyaan Pertamina di grup WA spesifik soal kesiapan LGU saja.
Grafik & tabel tren di Bagian 2 diubah untuk melacak progres LGU & ITB
(0% -> 100%), bukan angka gabungan 38%. Dicatat bahwa ambang >95% yang
disebut Pertamina sudah terlampaui dari sisi LGU, dengan caveat RU IV
dan Vendor Instalasi masih 0%. KPI 4-track dan breakdown per kategori
tidak diubah, tetap menampilkan keempat pihak sebagai konteks.
</commit_message>
<xml_diff>
--- a/Deliverables/Kurva_S_Persiapan_Instalasi_RU-IV_Cilacap.docx
+++ b/Deliverables/Kurva_S_Persiapan_Instalasi_RU-IV_Cilacap.docx
@@ -792,7 +792,7 @@
           <w:color w:val="262626"/>
           <w:sz w:val="19"/>
         </w:rPr>
-        <w:t>Baru ada dua titik data yang bisa dipertanggungjawabkan secara tertulis: saat checklist kerja bersama pertama kali disusun (10 September 2026) dan hari ini (18 September 2026). Belum ada pengukuran harian di antara keduanya, sehingga tren di bawah ini menghubungkan dua titik nyata, bukan proyeksi presisi harian.</w:t>
+        <w:t>Kurva ini melacak progres LGU &amp; ITB secara khusus — sesuai pertanyaan yang diajukan Pertamina ('dari sisi LGU persiapannya sudah berapa persen?'), bukan angka gabungan tiga pihak. Baru ada dua titik data yang bisa dipertanggungjawabkan secara tertulis: saat checklist kerja bersama pertama kali disusun (10 September 2026) dan hari ini (18 September 2026).</w:t>
       </w:r>
     </w:p>
     <w:p>
@@ -846,7 +846,7 @@
           <w:color w:val="808080"/>
           <w:sz w:val="16"/>
         </w:rPr>
-        <w:t>Grafik 1. Kurva-S persiapan instalasi RU IV Cilacap — garis solid: aktual, garis putus-putus: proyeksi arah (belum bertanggal pasti)</w:t>
+        <w:t>Grafik 1. Kurva-S kesiapan LGU &amp; ITB, persiapan instalasi RU IV Cilacap</w:t>
       </w:r>
     </w:p>
     <w:tbl>
@@ -953,7 +953,7 @@
                 <w:color w:val="FFFFFF"/>
                 <w:sz w:val="16"/>
               </w:rPr>
-              <w:t>Progres keseluruhan</w:t>
+              <w:t>Progres LGU &amp; ITB</w:t>
             </w:r>
           </w:p>
         </w:tc>
@@ -1094,7 +1094,7 @@
                 <w:color w:val="262626"/>
                 <w:sz w:val="18"/>
               </w:rPr>
-              <w:t>Snapshot terkini — dasar dokumen ini</w:t>
+              <w:t>Seluruh 15 item tanggung jawab LGU &amp; ITB selesai/siap</w:t>
             </w:r>
           </w:p>
         </w:tc>
@@ -1122,90 +1122,7 @@
                 <w:color w:val="262626"/>
                 <w:sz w:val="18"/>
               </w:rPr>
-              <w:t>38%</w:t>
-            </w:r>
-          </w:p>
-        </w:tc>
-      </w:tr>
-      <w:tr>
-        <w:tc>
-          <w:tcPr>
-            <w:tcW w:type="dxa" w:w="2448"/>
-            <w:vAlign w:val="center"/>
-            <w:tcMar>
-              <w:top w:w="70" w:type="dxa"/>
-              <w:start w:w="90" w:type="dxa"/>
-              <w:bottom w:w="70" w:type="dxa"/>
-              <w:end w:w="90" w:type="dxa"/>
-            </w:tcMar>
-          </w:tcPr>
-          <w:p>
-            <w:pPr>
-              <w:spacing w:after="0" w:before="0" w:line="252" w:lineRule="auto"/>
-              <w:jc w:val="center"/>
-            </w:pPr>
-            <w:r>
-              <w:rPr>
-                <w:rFonts w:ascii="Arial" w:hAnsi="Arial"/>
-                <w:b w:val="0"/>
-                <w:color w:val="262626"/>
-                <w:sz w:val="18"/>
-              </w:rPr>
-              <w:t>Belum ditentukan</w:t>
-            </w:r>
-          </w:p>
-        </w:tc>
-        <w:tc>
-          <w:tcPr>
-            <w:tcW w:type="dxa" w:w="5544"/>
-            <w:vAlign w:val="center"/>
-            <w:tcMar>
-              <w:top w:w="70" w:type="dxa"/>
-              <w:start w:w="90" w:type="dxa"/>
-              <w:bottom w:w="70" w:type="dxa"/>
-              <w:end w:w="90" w:type="dxa"/>
-            </w:tcMar>
-          </w:tcPr>
-          <w:p>
-            <w:pPr>
-              <w:spacing w:after="0" w:before="0" w:line="252" w:lineRule="auto"/>
-              <w:jc w:val="left"/>
-            </w:pPr>
-            <w:r>
-              <w:rPr>
-                <w:rFonts w:ascii="Arial" w:hAnsi="Arial"/>
-                <w:b w:val="0"/>
-                <w:color w:val="262626"/>
-                <w:sz w:val="18"/>
-              </w:rPr>
-              <w:t>Rencana lanjutan — menyusul pengesahan TRA/JSA, penugasan vendor resmi, dan penyediaan infrastruktur oleh RU IV</w:t>
-            </w:r>
-          </w:p>
-        </w:tc>
-        <w:tc>
-          <w:tcPr>
-            <w:tcW w:type="dxa" w:w="1800"/>
-            <w:vAlign w:val="center"/>
-            <w:tcMar>
-              <w:top w:w="70" w:type="dxa"/>
-              <w:start w:w="90" w:type="dxa"/>
-              <w:bottom w:w="70" w:type="dxa"/>
-              <w:end w:w="90" w:type="dxa"/>
-            </w:tcMar>
-          </w:tcPr>
-          <w:p>
-            <w:pPr>
-              <w:spacing w:after="0" w:before="0" w:line="252" w:lineRule="auto"/>
-              <w:jc w:val="left"/>
-            </w:pPr>
-            <w:r>
-              <w:rPr>
-                <w:rFonts w:ascii="Arial" w:hAnsi="Arial"/>
-                <w:b w:val="0"/>
-                <w:color w:val="262626"/>
-                <w:sz w:val="18"/>
-              </w:rPr>
-              <w:t>→ menuju 95%*</w:t>
+              <w:t>100%</w:t>
             </w:r>
           </w:p>
         </w:tc>
@@ -1226,7 +1143,7 @@
           <w:color w:val="808080"/>
           <w:sz w:val="17"/>
         </w:rPr>
-        <w:t>* Ambang yang disebutkan Pertamina (18 September 2026): meeting lanjutan bersama RU IV baru akan diagendakan setelah progres keseluruhan melewati 95%.</w:t>
+        <w:t>* Ambang yang disebutkan Pertamina pada percakapan 18 September 2026 (&gt;95% agar meeting lanjutan bersama RU IV dapat diagendakan) sudah terlampaui dari sisi kesiapan LGU &amp; ITB. Ini tidak mencakup kesiapan Pertamina RU IV dan Vendor Instalasi, yang saat dokumen ini disusun masih 0% (lihat Bagian 1 dan 3) — perizinan dan penugasan resmi tetap berada di luar kendali LGU.</w:t>
       </w:r>
     </w:p>
     <w:p>

</xml_diff>

<commit_message>
Koreksi titik awal grafik Kurva-S ke kunjungan lapangan terakhir
Tanggal "10 September 2026" sebelumnya adalah saat checklist dibuat
di kantor, bukan tanggal kunjungan ke Cilacap. Diganti ke 9-10 Agustus
2026 (survey lokasi RU IV Cilacap, kunjungan lapangan terakhir yang
tercatat).
</commit_message>
<xml_diff>
--- a/Deliverables/Kurva_S_Persiapan_Instalasi_RU-IV_Cilacap.docx
+++ b/Deliverables/Kurva_S_Persiapan_Instalasi_RU-IV_Cilacap.docx
@@ -792,7 +792,7 @@
           <w:color w:val="262626"/>
           <w:sz w:val="19"/>
         </w:rPr>
-        <w:t>Kurva ini melacak progres LGU &amp; ITB secara khusus — sesuai pertanyaan yang diajukan Pertamina ('dari sisi LGU persiapannya sudah berapa persen?'), bukan angka gabungan tiga pihak. Baru ada dua titik data yang bisa dipertanggungjawabkan secara tertulis: saat checklist kerja bersama pertama kali disusun (10 September 2026) dan hari ini (18 September 2026).</w:t>
+        <w:t>Kurva ini melacak progres LGU &amp; ITB secara khusus — sesuai pertanyaan yang diajukan Pertamina ('dari sisi LGU persiapannya sudah berapa persen?'), bukan angka gabungan tiga pihak. Titik awal diambil dari kunjungan/survey lapangan terakhir ke RU IV Cilacap (9–10 Agustus 2026) — belum ada kunjungan lain setelahnya — dibandingkan dengan snapshot kesiapan hari ini (18 September 2026).</w:t>
       </w:r>
     </w:p>
     <w:p>
@@ -802,7 +802,7 @@
       <w:r>
         <w:drawing>
           <wp:inline xmlns:a="http://schemas.openxmlformats.org/drawingml/2006/main" xmlns:pic="http://schemas.openxmlformats.org/drawingml/2006/picture">
-            <wp:extent cx="6126480" cy="2932889"/>
+            <wp:extent cx="6126480" cy="2961569"/>
             <wp:docPr id="1" name="Picture 1"/>
             <wp:cNvGraphicFramePr>
               <a:graphicFrameLocks noChangeAspect="1"/>
@@ -823,7 +823,7 @@
                   <pic:spPr>
                     <a:xfrm>
                       <a:off x="0" y="0"/>
-                      <a:ext cx="6126480" cy="2932889"/>
+                      <a:ext cx="6126480" cy="2961569"/>
                     </a:xfrm>
                     <a:prstGeom prst="rect"/>
                   </pic:spPr>
@@ -982,7 +982,7 @@
                 <w:color w:val="262626"/>
                 <w:sz w:val="18"/>
               </w:rPr>
-              <w:t>10 September 2026</w:t>
+              <w:t>9–10 Agustus 2026</w:t>
             </w:r>
           </w:p>
         </w:tc>
@@ -1009,7 +1009,7 @@
                 <w:color w:val="262626"/>
                 <w:sz w:val="18"/>
               </w:rPr>
-              <w:t>Checklist kerja bersama tiga pihak pertama kali disusun</w:t>
+              <w:t>Survey lokasi RU IV Cilacap (kunjungan lapangan terakhir)</w:t>
             </w:r>
           </w:p>
         </w:tc>

</xml_diff>